<commit_message>
Spell out CQ (Cultural Quotient) for first-time readers
Explain the abbreviation in the site header, home page, toolkit,
competency label, score-chip tooltips, README and concept document.

Co-Authored-By: Claude Opus 5.5 <noreply@anthropic.com>
Claude-Session: https://claude.ai/code/session_01Ni39ZnMd4cAT3Juv4Es5wD
</commit_message>
<xml_diff>
--- a/docs/Relief-Map-Concept-Document.docx
+++ b/docs/Relief-Map-Concept-Document.docx
@@ -77,7 +77,7 @@
           <w:sz w:val="20"/>
           <w:szCs w:val="20"/>
         </w:rPr>
-        <w:t xml:space="preserve"> helps UN personnel build cultural intelligence and recognise implicit bias before and during fieldwork. Learners start from an interactive map of UN field missions (sourced from unmissions.org), read their duty station's mandate and geographic scope, then practise short, realistic decisions linked to that context. Each choice gets immediate feedback that names the bias involved and shows a better approach. All scenarios are fictional, so no real community is stereotyped.</w:t>
+        <w:t xml:space="preserve"> helps UN personnel build cultural intelligence (Cultural Quotient, or CQ) and recognise implicit bias before and during fieldwork. Learners start from an interactive map of UN field missions (sourced from unmissions.org), read their duty station's mandate and geographic scope, then practise short, realistic decisions linked to that context. Each choice gets immediate feedback that names the bias involved and shows a better approach. All scenarios are fictional, so no real community is stereotyped.</w:t>
       </w:r>
     </w:p>
     <w:p>
@@ -1054,7 +1054,7 @@
           <w:sz w:val="15"/>
           <w:szCs w:val="15"/>
         </w:rPr>
-        <w:t xml:space="preserve">*Scores in the order Cultural Intelligence, Bias Awareness, Evidence, Do No Harm.</w:t>
+        <w:t xml:space="preserve">*Scores in the order Cultural Intelligence (CQ), Bias Awareness, Evidence, Do No Harm.</w:t>
       </w:r>
     </w:p>
     <w:p>
@@ -1131,7 +1131,7 @@
           <w:sz w:val="20"/>
           <w:szCs w:val="20"/>
         </w:rPr>
-        <w:t xml:space="preserve">Cultural Intelligence</w:t>
+        <w:t xml:space="preserve">Cultural Intelligence (CQ)</w:t>
       </w:r>
       <w:r>
         <w:rPr>

</xml_diff>

<commit_message>
Make profile easy to find, use American English, update concept doc
- Nav: replace the unlabeled avatar with a visible "Create profile"
  button (shows the user's first name once saved); progress is reached
  from the profile. Home hero gets a "Create your profile" button.
- Convert site text to American English. Official UN names and internal
  IDs keep their original spelling so saved progress still loads.
- Concept document: American English and a learner-profile bullet;
  still two pages.

Co-Authored-By: Claude Opus 5.5 <noreply@anthropic.com>
Claude-Session: https://claude.ai/code/session_01Ni39ZnMd4cAT3Juv4Es5wD
</commit_message>
<xml_diff>
--- a/docs/Relief-Map-Concept-Document.docx
+++ b/docs/Relief-Map-Concept-Document.docx
@@ -77,7 +77,7 @@
           <w:sz w:val="20"/>
           <w:szCs w:val="20"/>
         </w:rPr>
-        <w:t xml:space="preserve"> helps UN personnel build cultural intelligence (Cultural Quotient, or CQ) and recognise implicit bias before and during fieldwork. Learners start from an interactive map of UN field missions (sourced from unmissions.org), read their duty station's mandate and geographic scope, then practise short, realistic decisions linked to that context. Each choice gets immediate feedback that names the bias involved and shows a better approach. All scenarios are fictional, so no real community is stereotyped.</w:t>
+        <w:t xml:space="preserve"> helps UN personnel build cultural intelligence (Cultural Quotient, or CQ) and recognize implicit bias before and during fieldwork. Learners start from an interactive map of UN field missions (sourced from unmissions.org), read their duty station's mandate and geographic scope, then practice short, realistic decisions linked to that context. Each choice gets immediate feedback that names the bias involved and shows a better approach. All scenarios are fictional, so no real community is stereotyped.</w:t>
       </w:r>
     </w:p>
     <w:p>
@@ -212,7 +212,7 @@
                 <w:sz w:val="18"/>
                 <w:szCs w:val="18"/>
               </w:rPr>
-              <w:t xml:space="preserve">3. Practise</w:t>
+              <w:t xml:space="preserve">3. Practice</w:t>
             </w:r>
           </w:p>
         </w:tc>
@@ -546,14 +546,14 @@
         </w:tblBorders>
       </w:tblPr>
       <w:tblGrid>
-        <w:gridCol w:w="3400"/>
-        <w:gridCol w:w="1600"/>
-        <w:gridCol w:w="5512"/>
+        <w:gridCol w:w="3150"/>
+        <w:gridCol w:w="1900"/>
+        <w:gridCol w:w="5462"/>
       </w:tblGrid>
       <w:tr>
         <w:tc>
           <w:tcPr>
-            <w:tcW w:type="dxa" w:w="3400"/>
+            <w:tcW w:type="dxa" w:w="3150"/>
             <w:tcBorders>
               <w:top w:val="single" w:color="D9DDE8" w:sz="4"/>
               <w:left w:val="single" w:color="D9DDE8" w:sz="4"/>
@@ -586,7 +586,7 @@
         </w:tc>
         <w:tc>
           <w:tcPr>
-            <w:tcW w:type="dxa" w:w="1600"/>
+            <w:tcW w:type="dxa" w:w="1900"/>
             <w:tcBorders>
               <w:top w:val="single" w:color="D9DDE8" w:sz="4"/>
               <w:left w:val="single" w:color="D9DDE8" w:sz="4"/>
@@ -619,7 +619,7 @@
         </w:tc>
         <w:tc>
           <w:tcPr>
-            <w:tcW w:type="dxa" w:w="5512"/>
+            <w:tcW w:type="dxa" w:w="5462"/>
             <w:tcBorders>
               <w:top w:val="single" w:color="D9DDE8" w:sz="4"/>
               <w:left w:val="single" w:color="D9DDE8" w:sz="4"/>
@@ -657,7 +657,7 @@
         </w:trPr>
         <w:tc>
           <w:tcPr>
-            <w:tcW w:type="dxa" w:w="3400"/>
+            <w:tcW w:type="dxa" w:w="3150"/>
             <w:tcBorders>
               <w:top w:val="single" w:color="D9DDE8" w:sz="4"/>
               <w:left w:val="single" w:color="D9DDE8" w:sz="4"/>
@@ -686,7 +686,7 @@
         </w:tc>
         <w:tc>
           <w:tcPr>
-            <w:tcW w:type="dxa" w:w="1600"/>
+            <w:tcW w:type="dxa" w:w="1900"/>
             <w:tcBorders>
               <w:top w:val="single" w:color="D9DDE8" w:sz="4"/>
               <w:left w:val="single" w:color="D9DDE8" w:sz="4"/>
@@ -715,7 +715,7 @@
         </w:tc>
         <w:tc>
           <w:tcPr>
-            <w:tcW w:type="dxa" w:w="5512"/>
+            <w:tcW w:type="dxa" w:w="5462"/>
             <w:tcBorders>
               <w:top w:val="single" w:color="D9DDE8" w:sz="4"/>
               <w:left w:val="single" w:color="D9DDE8" w:sz="4"/>
@@ -758,7 +758,7 @@
         </w:trPr>
         <w:tc>
           <w:tcPr>
-            <w:tcW w:type="dxa" w:w="3400"/>
+            <w:tcW w:type="dxa" w:w="3150"/>
             <w:tcBorders>
               <w:top w:val="single" w:color="D9DDE8" w:sz="4"/>
               <w:left w:val="single" w:color="D9DDE8" w:sz="4"/>
@@ -788,7 +788,7 @@
         </w:tc>
         <w:tc>
           <w:tcPr>
-            <w:tcW w:type="dxa" w:w="1600"/>
+            <w:tcW w:type="dxa" w:w="1900"/>
             <w:tcBorders>
               <w:top w:val="single" w:color="D9DDE8" w:sz="4"/>
               <w:left w:val="single" w:color="D9DDE8" w:sz="4"/>
@@ -818,7 +818,7 @@
         </w:tc>
         <w:tc>
           <w:tcPr>
-            <w:tcW w:type="dxa" w:w="5512"/>
+            <w:tcW w:type="dxa" w:w="5462"/>
             <w:tcBorders>
               <w:top w:val="single" w:color="D9DDE8" w:sz="4"/>
               <w:left w:val="single" w:color="D9DDE8" w:sz="4"/>
@@ -853,7 +853,7 @@
         </w:trPr>
         <w:tc>
           <w:tcPr>
-            <w:tcW w:type="dxa" w:w="3400"/>
+            <w:tcW w:type="dxa" w:w="3150"/>
             <w:tcBorders>
               <w:top w:val="single" w:color="D9DDE8" w:sz="4"/>
               <w:left w:val="single" w:color="D9DDE8" w:sz="4"/>
@@ -882,7 +882,7 @@
         </w:tc>
         <w:tc>
           <w:tcPr>
-            <w:tcW w:type="dxa" w:w="1600"/>
+            <w:tcW w:type="dxa" w:w="1900"/>
             <w:tcBorders>
               <w:top w:val="single" w:color="D9DDE8" w:sz="4"/>
               <w:left w:val="single" w:color="D9DDE8" w:sz="4"/>
@@ -911,30 +911,30 @@
         </w:tc>
         <w:tc>
           <w:tcPr>
-            <w:tcW w:type="dxa" w:w="5512"/>
-            <w:tcBorders>
-              <w:top w:val="single" w:color="D9DDE8" w:sz="4"/>
-              <w:left w:val="single" w:color="D9DDE8" w:sz="4"/>
-              <w:bottom w:val="single" w:color="D9DDE8" w:sz="4"/>
-              <w:right w:val="single" w:color="D9DDE8" w:sz="4"/>
-            </w:tcBorders>
-            <w:tcMar>
-              <w:top w:type="dxa" w:w="45"/>
-              <w:left w:type="dxa" w:w="90"/>
-              <w:bottom w:type="dxa" w:w="45"/>
-              <w:right w:type="dxa" w:w="90"/>
-            </w:tcMar>
-          </w:tcPr>
-          <w:p>
-            <w:pPr>
-              <w:spacing w:after="20" w:line="235"/>
-            </w:pPr>
-            <w:r>
-              <w:rPr>
-                <w:sz w:val="18"/>
-                <w:szCs w:val="18"/>
-              </w:rPr>
-              <w:t xml:space="preserve">Right to centre women, but bypassing leaders may cause backlash, and the water point is not a safe, private space.</w:t>
+            <w:tcW w:type="dxa" w:w="5462"/>
+            <w:tcBorders>
+              <w:top w:val="single" w:color="D9DDE8" w:sz="4"/>
+              <w:left w:val="single" w:color="D9DDE8" w:sz="4"/>
+              <w:bottom w:val="single" w:color="D9DDE8" w:sz="4"/>
+              <w:right w:val="single" w:color="D9DDE8" w:sz="4"/>
+            </w:tcBorders>
+            <w:tcMar>
+              <w:top w:type="dxa" w:w="45"/>
+              <w:left w:type="dxa" w:w="90"/>
+              <w:bottom w:type="dxa" w:w="45"/>
+              <w:right w:type="dxa" w:w="90"/>
+            </w:tcMar>
+          </w:tcPr>
+          <w:p>
+            <w:pPr>
+              <w:spacing w:after="20" w:line="235"/>
+            </w:pPr>
+            <w:r>
+              <w:rPr>
+                <w:sz w:val="18"/>
+                <w:szCs w:val="18"/>
+              </w:rPr>
+              <w:t xml:space="preserve">Right to center women, but bypassing leaders may cause backlash, and the water point is not a safe, private space.</w:t>
             </w:r>
           </w:p>
         </w:tc>
@@ -945,7 +945,7 @@
         </w:trPr>
         <w:tc>
           <w:tcPr>
-            <w:tcW w:type="dxa" w:w="3400"/>
+            <w:tcW w:type="dxa" w:w="3150"/>
             <w:tcBorders>
               <w:top w:val="single" w:color="D9DDE8" w:sz="4"/>
               <w:left w:val="single" w:color="D9DDE8" w:sz="4"/>
@@ -975,7 +975,7 @@
         </w:tc>
         <w:tc>
           <w:tcPr>
-            <w:tcW w:type="dxa" w:w="1600"/>
+            <w:tcW w:type="dxa" w:w="1900"/>
             <w:tcBorders>
               <w:top w:val="single" w:color="D9DDE8" w:sz="4"/>
               <w:left w:val="single" w:color="D9DDE8" w:sz="4"/>
@@ -1005,7 +1005,7 @@
         </w:tc>
         <w:tc>
           <w:tcPr>
-            <w:tcW w:type="dxa" w:w="5512"/>
+            <w:tcW w:type="dxa" w:w="5462"/>
             <w:tcBorders>
               <w:top w:val="single" w:color="D9DDE8" w:sz="4"/>
               <w:left w:val="single" w:color="D9DDE8" w:sz="4"/>
@@ -1070,7 +1070,7 @@
           <w:sz w:val="23"/>
           <w:szCs w:val="23"/>
         </w:rPr>
-        <w:t xml:space="preserve">4. Feedback and proposed scoring</w:t>
+        <w:t xml:space="preserve">4. Feedback, proposed scoring and learner profile</w:t>
       </w:r>
     </w:p>
     <w:p>
@@ -1187,6 +1187,64 @@
           <w:szCs w:val="20"/>
         </w:rPr>
         <w:t xml:space="preserve">. Score = points earned ÷ points possible. Proposed bands: Emerging (under 50%), Developing (50–74%), Proficient (75% and above).</w:t>
+      </w:r>
+    </w:p>
+    <w:p>
+      <w:pPr>
+        <w:pStyle w:val="ListParagraph"/>
+        <w:numPr>
+          <w:ilvl w:val="0"/>
+          <w:numId w:val="2"/>
+        </w:numPr>
+        <w:spacing w:after="30" w:line="245"/>
+      </w:pPr>
+      <w:r>
+        <w:rPr>
+          <w:b/>
+          <w:bCs/>
+          <w:sz w:val="20"/>
+          <w:szCs w:val="20"/>
+        </w:rPr>
+        <w:t xml:space="preserve">Learner profile:</w:t>
+      </w:r>
+      <w:r>
+        <w:rPr>
+          <w:sz w:val="20"/>
+          <w:szCs w:val="20"/>
+        </w:rPr>
+        <w:t xml:space="preserve"> learners create a profile with a photo, headline, duty station, languages and a learning goal. It shows their competency scores, earned badges (such as </w:t>
+      </w:r>
+      <w:r>
+        <w:rPr>
+          <w:i/>
+          <w:iCs/>
+          <w:sz w:val="20"/>
+          <w:szCs w:val="20"/>
+        </w:rPr>
+        <w:t xml:space="preserve">Bias spotter</w:t>
+      </w:r>
+      <w:r>
+        <w:rPr>
+          <w:sz w:val="20"/>
+          <w:szCs w:val="20"/>
+        </w:rPr>
+        <w:t xml:space="preserve"> and </w:t>
+      </w:r>
+      <w:r>
+        <w:rPr>
+          <w:i/>
+          <w:iCs/>
+          <w:sz w:val="20"/>
+          <w:szCs w:val="20"/>
+        </w:rPr>
+        <w:t xml:space="preserve">Team player</w:t>
+      </w:r>
+      <w:r>
+        <w:rPr>
+          <w:sz w:val="20"/>
+          <w:szCs w:val="20"/>
+        </w:rPr>
+        <w:t xml:space="preserve">) and recent activity. A downloadable backup lets them move their progress to another device.</w:t>
       </w:r>
     </w:p>
     <w:p>
@@ -1609,7 +1667,7 @@
           <w:sz w:val="20"/>
           <w:szCs w:val="20"/>
         </w:rPr>
-        <w:t xml:space="preserve"> bias also lives in team habits: who speaks first, whose expertise counts and whose voice is missing. Team Compass helps teams spread across duty stations and time zones practise inclusive decision-making together, using the same scenarios as Relief Map.</w:t>
+        <w:t xml:space="preserve"> bias also lives in team habits: who speaks first, whose expertise counts and whose voice is missing. Team Compass helps teams spread across duty stations and time zones practice inclusive decision-making together, using the same scenarios as Relief Map.</w:t>
       </w:r>
     </w:p>
     <w:p>

</xml_diff>

<commit_message>
Credit the Relief Maps+ creators and show the globe in the concept document
The dimensions framework builds on Relief Maps+, so credit its creators,
Maria Rodó-Zárate and the INTERMAPS team at Universitat Pompeu Fabra:

- Concept document: in-text citation and an APA reference list
  (INTERMAPS, 2024; Rodó-Zárate, 2023). The "Mission map" screen now
  shows the current globe instead of the old flat map. Still 2 pages.
- Toolkit: credit line under the dimensions framework, linking the
  platform and the article.
- Footer: short credit on every page.
- README: attribution and references.
- Use the platform's own spelling, "Relief Maps+".

Co-Authored-By: Claude Opus 5.5 <noreply@anthropic.com>
Claude-Session: https://claude.ai/code/session_01Ni39ZnMd4cAT3Juv4Es5wD
</commit_message>
<xml_diff>
--- a/docs/Relief-Map-Concept-Document.docx
+++ b/docs/Relief-Map-Concept-Document.docx
@@ -27,7 +27,7 @@
           <w:sz w:val="20"/>
           <w:szCs w:val="20"/>
         </w:rPr>
-        <w:t xml:space="preserve">A cultural intelligence and implicit-bias learning tool for UN fieldwork, with an outline of Team Compass, a global team collaboration tool</w:t>
+        <w:t xml:space="preserve">A cultural intelligence and implicit-bias learning tool for UN fieldwork, with an outline of Team Compass for global teams</w:t>
       </w:r>
     </w:p>
     <w:p>
@@ -98,14 +98,14 @@
           <w:sz w:val="18"/>
           <w:szCs w:val="18"/>
         </w:rPr>
-        <w:t xml:space="preserve">ReliefMaps+</w:t>
-      </w:r>
-      <w:r>
-        <w:rPr>
-          <w:sz w:val="18"/>
-          <w:szCs w:val="18"/>
-        </w:rPr>
-        <w:t xml:space="preserve">, which studies lived experience through social positions, places and emotions. Where ReliefMaps+ asks how the same person experiences different spaces differently, Relief Map asks how different people experience the same duty station differently, adapting that foundation for UN fieldwork rather than copying it.</w:t>
+        <w:t xml:space="preserve">Relief Maps+</w:t>
+      </w:r>
+      <w:r>
+        <w:rPr>
+          <w:sz w:val="18"/>
+          <w:szCs w:val="18"/>
+        </w:rPr>
+        <w:t xml:space="preserve">, created by Maria Rodó-Zárate's INTERMAPS team at Universitat Pompeu Fabra to study lived experience through social positions, places and emotions (INTERMAPS, 2024; Rodó-Zárate, 2023). Where Relief Maps+ asks how the same person experiences different spaces differently, Relief Map asks how different people experience the same duty station differently, adapting that foundation for UN fieldwork rather than copying it.</w:t>
       </w:r>
     </w:p>
     <w:p>
@@ -217,9 +217,9 @@
             </w:tcBorders>
             <w:shd w:fill="12406F" w:color="auto" w:val="clear"/>
             <w:tcMar>
-              <w:top w:type="dxa" w:w="30"/>
-              <w:left w:type="dxa" w:w="75"/>
-              <w:bottom w:type="dxa" w:w="30"/>
+              <w:top w:type="dxa" w:w="20"/>
+              <w:left w:type="dxa" w:w="75"/>
+              <w:bottom w:type="dxa" w:w="20"/>
               <w:right w:type="dxa" w:w="75"/>
             </w:tcMar>
           </w:tcPr>
@@ -250,9 +250,9 @@
             </w:tcBorders>
             <w:shd w:fill="12406F" w:color="auto" w:val="clear"/>
             <w:tcMar>
-              <w:top w:type="dxa" w:w="30"/>
-              <w:left w:type="dxa" w:w="75"/>
-              <w:bottom w:type="dxa" w:w="30"/>
+              <w:top w:type="dxa" w:w="20"/>
+              <w:left w:type="dxa" w:w="75"/>
+              <w:bottom w:type="dxa" w:w="20"/>
               <w:right w:type="dxa" w:w="75"/>
             </w:tcMar>
           </w:tcPr>
@@ -283,9 +283,9 @@
             </w:tcBorders>
             <w:shd w:fill="12406F" w:color="auto" w:val="clear"/>
             <w:tcMar>
-              <w:top w:type="dxa" w:w="30"/>
-              <w:left w:type="dxa" w:w="75"/>
-              <w:bottom w:type="dxa" w:w="30"/>
+              <w:top w:type="dxa" w:w="20"/>
+              <w:left w:type="dxa" w:w="75"/>
+              <w:bottom w:type="dxa" w:w="20"/>
               <w:right w:type="dxa" w:w="75"/>
             </w:tcMar>
           </w:tcPr>
@@ -316,9 +316,9 @@
             </w:tcBorders>
             <w:shd w:fill="12406F" w:color="auto" w:val="clear"/>
             <w:tcMar>
-              <w:top w:type="dxa" w:w="30"/>
-              <w:left w:type="dxa" w:w="75"/>
-              <w:bottom w:type="dxa" w:w="30"/>
+              <w:top w:type="dxa" w:w="20"/>
+              <w:left w:type="dxa" w:w="75"/>
+              <w:bottom w:type="dxa" w:w="20"/>
               <w:right w:type="dxa" w:w="75"/>
             </w:tcMar>
           </w:tcPr>
@@ -353,9 +353,9 @@
               <w:right w:val="single" w:color="D9DDE8" w:sz="4"/>
             </w:tcBorders>
             <w:tcMar>
-              <w:top w:type="dxa" w:w="30"/>
-              <w:left w:type="dxa" w:w="75"/>
-              <w:bottom w:type="dxa" w:w="30"/>
+              <w:top w:type="dxa" w:w="20"/>
+              <w:left w:type="dxa" w:w="75"/>
+              <w:bottom w:type="dxa" w:w="20"/>
               <w:right w:type="dxa" w:w="75"/>
             </w:tcMar>
           </w:tcPr>
@@ -382,9 +382,9 @@
               <w:right w:val="single" w:color="D9DDE8" w:sz="4"/>
             </w:tcBorders>
             <w:tcMar>
-              <w:top w:type="dxa" w:w="30"/>
-              <w:left w:type="dxa" w:w="75"/>
-              <w:bottom w:type="dxa" w:w="30"/>
+              <w:top w:type="dxa" w:w="20"/>
+              <w:left w:type="dxa" w:w="75"/>
+              <w:bottom w:type="dxa" w:w="20"/>
               <w:right w:type="dxa" w:w="75"/>
             </w:tcMar>
           </w:tcPr>
@@ -411,9 +411,9 @@
               <w:right w:val="single" w:color="D9DDE8" w:sz="4"/>
             </w:tcBorders>
             <w:tcMar>
-              <w:top w:type="dxa" w:w="30"/>
-              <w:left w:type="dxa" w:w="75"/>
-              <w:bottom w:type="dxa" w:w="30"/>
+              <w:top w:type="dxa" w:w="20"/>
+              <w:left w:type="dxa" w:w="75"/>
+              <w:bottom w:type="dxa" w:w="20"/>
               <w:right w:type="dxa" w:w="75"/>
             </w:tcMar>
           </w:tcPr>
@@ -440,9 +440,9 @@
               <w:right w:val="single" w:color="D9DDE8" w:sz="4"/>
             </w:tcBorders>
             <w:tcMar>
-              <w:top w:type="dxa" w:w="30"/>
-              <w:left w:type="dxa" w:w="75"/>
-              <w:bottom w:type="dxa" w:w="30"/>
+              <w:top w:type="dxa" w:w="20"/>
+              <w:left w:type="dxa" w:w="75"/>
+              <w:bottom w:type="dxa" w:w="20"/>
               <w:right w:type="dxa" w:w="75"/>
             </w:tcMar>
           </w:tcPr>
@@ -475,9 +475,9 @@
             </w:tcBorders>
             <w:shd w:fill="F7F8FC" w:color="auto" w:val="clear"/>
             <w:tcMar>
-              <w:top w:type="dxa" w:w="30"/>
-              <w:left w:type="dxa" w:w="75"/>
-              <w:bottom w:type="dxa" w:w="30"/>
+              <w:top w:type="dxa" w:w="20"/>
+              <w:left w:type="dxa" w:w="75"/>
+              <w:bottom w:type="dxa" w:w="20"/>
               <w:right w:type="dxa" w:w="75"/>
             </w:tcMar>
           </w:tcPr>
@@ -505,9 +505,9 @@
             </w:tcBorders>
             <w:shd w:fill="F7F8FC" w:color="auto" w:val="clear"/>
             <w:tcMar>
-              <w:top w:type="dxa" w:w="30"/>
-              <w:left w:type="dxa" w:w="75"/>
-              <w:bottom w:type="dxa" w:w="30"/>
+              <w:top w:type="dxa" w:w="20"/>
+              <w:left w:type="dxa" w:w="75"/>
+              <w:bottom w:type="dxa" w:w="20"/>
               <w:right w:type="dxa" w:w="75"/>
             </w:tcMar>
           </w:tcPr>
@@ -535,9 +535,9 @@
             </w:tcBorders>
             <w:shd w:fill="F7F8FC" w:color="auto" w:val="clear"/>
             <w:tcMar>
-              <w:top w:type="dxa" w:w="30"/>
-              <w:left w:type="dxa" w:w="75"/>
-              <w:bottom w:type="dxa" w:w="30"/>
+              <w:top w:type="dxa" w:w="20"/>
+              <w:left w:type="dxa" w:w="75"/>
+              <w:bottom w:type="dxa" w:w="20"/>
               <w:right w:type="dxa" w:w="75"/>
             </w:tcMar>
           </w:tcPr>
@@ -565,9 +565,9 @@
             </w:tcBorders>
             <w:shd w:fill="F7F8FC" w:color="auto" w:val="clear"/>
             <w:tcMar>
-              <w:top w:type="dxa" w:w="30"/>
-              <w:left w:type="dxa" w:w="75"/>
-              <w:bottom w:type="dxa" w:w="30"/>
+              <w:top w:type="dxa" w:w="20"/>
+              <w:left w:type="dxa" w:w="75"/>
+              <w:bottom w:type="dxa" w:w="20"/>
               <w:right w:type="dxa" w:w="75"/>
             </w:tcMar>
           </w:tcPr>
@@ -599,9 +599,9 @@
               <w:right w:val="single" w:color="D9DDE8" w:sz="4"/>
             </w:tcBorders>
             <w:tcMar>
-              <w:top w:type="dxa" w:w="30"/>
-              <w:left w:type="dxa" w:w="75"/>
-              <w:bottom w:type="dxa" w:w="30"/>
+              <w:top w:type="dxa" w:w="20"/>
+              <w:left w:type="dxa" w:w="75"/>
+              <w:bottom w:type="dxa" w:w="20"/>
               <w:right w:type="dxa" w:w="75"/>
             </w:tcMar>
           </w:tcPr>
@@ -628,9 +628,9 @@
               <w:right w:val="single" w:color="D9DDE8" w:sz="4"/>
             </w:tcBorders>
             <w:tcMar>
-              <w:top w:type="dxa" w:w="30"/>
-              <w:left w:type="dxa" w:w="75"/>
-              <w:bottom w:type="dxa" w:w="30"/>
+              <w:top w:type="dxa" w:w="20"/>
+              <w:left w:type="dxa" w:w="75"/>
+              <w:bottom w:type="dxa" w:w="20"/>
               <w:right w:type="dxa" w:w="75"/>
             </w:tcMar>
           </w:tcPr>
@@ -657,9 +657,9 @@
               <w:right w:val="single" w:color="D9DDE8" w:sz="4"/>
             </w:tcBorders>
             <w:tcMar>
-              <w:top w:type="dxa" w:w="30"/>
-              <w:left w:type="dxa" w:w="75"/>
-              <w:bottom w:type="dxa" w:w="30"/>
+              <w:top w:type="dxa" w:w="20"/>
+              <w:left w:type="dxa" w:w="75"/>
+              <w:bottom w:type="dxa" w:w="20"/>
               <w:right w:type="dxa" w:w="75"/>
             </w:tcMar>
           </w:tcPr>
@@ -686,9 +686,9 @@
               <w:right w:val="single" w:color="D9DDE8" w:sz="4"/>
             </w:tcBorders>
             <w:tcMar>
-              <w:top w:type="dxa" w:w="30"/>
-              <w:left w:type="dxa" w:w="75"/>
-              <w:bottom w:type="dxa" w:w="30"/>
+              <w:top w:type="dxa" w:w="20"/>
+              <w:left w:type="dxa" w:w="75"/>
+              <w:bottom w:type="dxa" w:w="20"/>
               <w:right w:type="dxa" w:w="75"/>
             </w:tcMar>
           </w:tcPr>
@@ -721,9 +721,9 @@
             </w:tcBorders>
             <w:shd w:fill="F7F8FC" w:color="auto" w:val="clear"/>
             <w:tcMar>
-              <w:top w:type="dxa" w:w="30"/>
-              <w:left w:type="dxa" w:w="75"/>
-              <w:bottom w:type="dxa" w:w="30"/>
+              <w:top w:type="dxa" w:w="20"/>
+              <w:left w:type="dxa" w:w="75"/>
+              <w:bottom w:type="dxa" w:w="20"/>
               <w:right w:type="dxa" w:w="75"/>
             </w:tcMar>
           </w:tcPr>
@@ -751,9 +751,9 @@
             </w:tcBorders>
             <w:shd w:fill="F7F8FC" w:color="auto" w:val="clear"/>
             <w:tcMar>
-              <w:top w:type="dxa" w:w="30"/>
-              <w:left w:type="dxa" w:w="75"/>
-              <w:bottom w:type="dxa" w:w="30"/>
+              <w:top w:type="dxa" w:w="20"/>
+              <w:left w:type="dxa" w:w="75"/>
+              <w:bottom w:type="dxa" w:w="20"/>
               <w:right w:type="dxa" w:w="75"/>
             </w:tcMar>
           </w:tcPr>
@@ -781,9 +781,9 @@
             </w:tcBorders>
             <w:shd w:fill="F7F8FC" w:color="auto" w:val="clear"/>
             <w:tcMar>
-              <w:top w:type="dxa" w:w="30"/>
-              <w:left w:type="dxa" w:w="75"/>
-              <w:bottom w:type="dxa" w:w="30"/>
+              <w:top w:type="dxa" w:w="20"/>
+              <w:left w:type="dxa" w:w="75"/>
+              <w:bottom w:type="dxa" w:w="20"/>
               <w:right w:type="dxa" w:w="75"/>
             </w:tcMar>
           </w:tcPr>
@@ -811,9 +811,9 @@
             </w:tcBorders>
             <w:shd w:fill="F7F8FC" w:color="auto" w:val="clear"/>
             <w:tcMar>
-              <w:top w:type="dxa" w:w="30"/>
-              <w:left w:type="dxa" w:w="75"/>
-              <w:bottom w:type="dxa" w:w="30"/>
+              <w:top w:type="dxa" w:w="20"/>
+              <w:left w:type="dxa" w:w="75"/>
+              <w:bottom w:type="dxa" w:w="20"/>
               <w:right w:type="dxa" w:w="75"/>
             </w:tcMar>
           </w:tcPr>
@@ -883,9 +883,9 @@
             </w:tcBorders>
             <w:shd w:fill="12406F" w:color="auto" w:val="clear"/>
             <w:tcMar>
-              <w:top w:type="dxa" w:w="30"/>
-              <w:left w:type="dxa" w:w="75"/>
-              <w:bottom w:type="dxa" w:w="30"/>
+              <w:top w:type="dxa" w:w="20"/>
+              <w:left w:type="dxa" w:w="75"/>
+              <w:bottom w:type="dxa" w:w="20"/>
               <w:right w:type="dxa" w:w="75"/>
             </w:tcMar>
           </w:tcPr>
@@ -916,9 +916,9 @@
             </w:tcBorders>
             <w:shd w:fill="12406F" w:color="auto" w:val="clear"/>
             <w:tcMar>
-              <w:top w:type="dxa" w:w="30"/>
-              <w:left w:type="dxa" w:w="75"/>
-              <w:bottom w:type="dxa" w:w="30"/>
+              <w:top w:type="dxa" w:w="20"/>
+              <w:left w:type="dxa" w:w="75"/>
+              <w:bottom w:type="dxa" w:w="20"/>
               <w:right w:type="dxa" w:w="75"/>
             </w:tcMar>
           </w:tcPr>
@@ -949,9 +949,9 @@
             </w:tcBorders>
             <w:shd w:fill="12406F" w:color="auto" w:val="clear"/>
             <w:tcMar>
-              <w:top w:type="dxa" w:w="30"/>
-              <w:left w:type="dxa" w:w="75"/>
-              <w:bottom w:type="dxa" w:w="30"/>
+              <w:top w:type="dxa" w:w="20"/>
+              <w:left w:type="dxa" w:w="75"/>
+              <w:bottom w:type="dxa" w:w="20"/>
               <w:right w:type="dxa" w:w="75"/>
             </w:tcMar>
           </w:tcPr>
@@ -982,9 +982,9 @@
             </w:tcBorders>
             <w:shd w:fill="12406F" w:color="auto" w:val="clear"/>
             <w:tcMar>
-              <w:top w:type="dxa" w:w="30"/>
-              <w:left w:type="dxa" w:w="75"/>
-              <w:bottom w:type="dxa" w:w="30"/>
+              <w:top w:type="dxa" w:w="20"/>
+              <w:left w:type="dxa" w:w="75"/>
+              <w:bottom w:type="dxa" w:w="20"/>
               <w:right w:type="dxa" w:w="75"/>
             </w:tcMar>
           </w:tcPr>
@@ -1015,9 +1015,9 @@
             </w:tcBorders>
             <w:shd w:fill="12406F" w:color="auto" w:val="clear"/>
             <w:tcMar>
-              <w:top w:type="dxa" w:w="30"/>
-              <w:left w:type="dxa" w:w="75"/>
-              <w:bottom w:type="dxa" w:w="30"/>
+              <w:top w:type="dxa" w:w="20"/>
+              <w:left w:type="dxa" w:w="75"/>
+              <w:bottom w:type="dxa" w:w="20"/>
               <w:right w:type="dxa" w:w="75"/>
             </w:tcMar>
           </w:tcPr>
@@ -1048,9 +1048,9 @@
             </w:tcBorders>
             <w:shd w:fill="12406F" w:color="auto" w:val="clear"/>
             <w:tcMar>
-              <w:top w:type="dxa" w:w="30"/>
-              <w:left w:type="dxa" w:w="75"/>
-              <w:bottom w:type="dxa" w:w="30"/>
+              <w:top w:type="dxa" w:w="20"/>
+              <w:left w:type="dxa" w:w="75"/>
+              <w:bottom w:type="dxa" w:w="20"/>
               <w:right w:type="dxa" w:w="75"/>
             </w:tcMar>
           </w:tcPr>
@@ -1085,9 +1085,9 @@
               <w:right w:val="single" w:color="D9DDE8" w:sz="4"/>
             </w:tcBorders>
             <w:tcMar>
-              <w:top w:type="dxa" w:w="30"/>
-              <w:left w:type="dxa" w:w="75"/>
-              <w:bottom w:type="dxa" w:w="30"/>
+              <w:top w:type="dxa" w:w="20"/>
+              <w:left w:type="dxa" w:w="75"/>
+              <w:bottom w:type="dxa" w:w="20"/>
               <w:right w:type="dxa" w:w="75"/>
             </w:tcMar>
           </w:tcPr>
@@ -1114,9 +1114,9 @@
               <w:right w:val="single" w:color="D9DDE8" w:sz="4"/>
             </w:tcBorders>
             <w:tcMar>
-              <w:top w:type="dxa" w:w="30"/>
-              <w:left w:type="dxa" w:w="75"/>
-              <w:bottom w:type="dxa" w:w="30"/>
+              <w:top w:type="dxa" w:w="20"/>
+              <w:left w:type="dxa" w:w="75"/>
+              <w:bottom w:type="dxa" w:w="20"/>
               <w:right w:type="dxa" w:w="75"/>
             </w:tcMar>
           </w:tcPr>
@@ -1143,9 +1143,9 @@
               <w:right w:val="single" w:color="D9DDE8" w:sz="4"/>
             </w:tcBorders>
             <w:tcMar>
-              <w:top w:type="dxa" w:w="30"/>
-              <w:left w:type="dxa" w:w="75"/>
-              <w:bottom w:type="dxa" w:w="30"/>
+              <w:top w:type="dxa" w:w="20"/>
+              <w:left w:type="dxa" w:w="75"/>
+              <w:bottom w:type="dxa" w:w="20"/>
               <w:right w:type="dxa" w:w="75"/>
             </w:tcMar>
           </w:tcPr>
@@ -1172,9 +1172,9 @@
               <w:right w:val="single" w:color="D9DDE8" w:sz="4"/>
             </w:tcBorders>
             <w:tcMar>
-              <w:top w:type="dxa" w:w="30"/>
-              <w:left w:type="dxa" w:w="75"/>
-              <w:bottom w:type="dxa" w:w="30"/>
+              <w:top w:type="dxa" w:w="20"/>
+              <w:left w:type="dxa" w:w="75"/>
+              <w:bottom w:type="dxa" w:w="20"/>
               <w:right w:type="dxa" w:w="75"/>
             </w:tcMar>
           </w:tcPr>
@@ -1201,9 +1201,9 @@
               <w:right w:val="single" w:color="D9DDE8" w:sz="4"/>
             </w:tcBorders>
             <w:tcMar>
-              <w:top w:type="dxa" w:w="30"/>
-              <w:left w:type="dxa" w:w="75"/>
-              <w:bottom w:type="dxa" w:w="30"/>
+              <w:top w:type="dxa" w:w="20"/>
+              <w:left w:type="dxa" w:w="75"/>
+              <w:bottom w:type="dxa" w:w="20"/>
               <w:right w:type="dxa" w:w="75"/>
             </w:tcMar>
           </w:tcPr>
@@ -1230,9 +1230,9 @@
               <w:right w:val="single" w:color="D9DDE8" w:sz="4"/>
             </w:tcBorders>
             <w:tcMar>
-              <w:top w:type="dxa" w:w="30"/>
-              <w:left w:type="dxa" w:w="75"/>
-              <w:bottom w:type="dxa" w:w="30"/>
+              <w:top w:type="dxa" w:w="20"/>
+              <w:left w:type="dxa" w:w="75"/>
+              <w:bottom w:type="dxa" w:w="20"/>
               <w:right w:type="dxa" w:w="75"/>
             </w:tcMar>
           </w:tcPr>
@@ -1321,9 +1321,9 @@
             </w:tcBorders>
             <w:shd w:fill="12406F" w:color="auto" w:val="clear"/>
             <w:tcMar>
-              <w:top w:type="dxa" w:w="30"/>
-              <w:left w:type="dxa" w:w="75"/>
-              <w:bottom w:type="dxa" w:w="30"/>
+              <w:top w:type="dxa" w:w="20"/>
+              <w:left w:type="dxa" w:w="75"/>
+              <w:bottom w:type="dxa" w:w="20"/>
               <w:right w:type="dxa" w:w="75"/>
             </w:tcMar>
           </w:tcPr>
@@ -1354,9 +1354,9 @@
             </w:tcBorders>
             <w:shd w:fill="12406F" w:color="auto" w:val="clear"/>
             <w:tcMar>
-              <w:top w:type="dxa" w:w="30"/>
-              <w:left w:type="dxa" w:w="75"/>
-              <w:bottom w:type="dxa" w:w="30"/>
+              <w:top w:type="dxa" w:w="20"/>
+              <w:left w:type="dxa" w:w="75"/>
+              <w:bottom w:type="dxa" w:w="20"/>
               <w:right w:type="dxa" w:w="75"/>
             </w:tcMar>
           </w:tcPr>
@@ -1387,9 +1387,9 @@
             </w:tcBorders>
             <w:shd w:fill="12406F" w:color="auto" w:val="clear"/>
             <w:tcMar>
-              <w:top w:type="dxa" w:w="30"/>
-              <w:left w:type="dxa" w:w="75"/>
-              <w:bottom w:type="dxa" w:w="30"/>
+              <w:top w:type="dxa" w:w="20"/>
+              <w:left w:type="dxa" w:w="75"/>
+              <w:bottom w:type="dxa" w:w="20"/>
               <w:right w:type="dxa" w:w="75"/>
             </w:tcMar>
           </w:tcPr>
@@ -1420,9 +1420,9 @@
             </w:tcBorders>
             <w:shd w:fill="12406F" w:color="auto" w:val="clear"/>
             <w:tcMar>
-              <w:top w:type="dxa" w:w="30"/>
-              <w:left w:type="dxa" w:w="75"/>
-              <w:bottom w:type="dxa" w:w="30"/>
+              <w:top w:type="dxa" w:w="20"/>
+              <w:left w:type="dxa" w:w="75"/>
+              <w:bottom w:type="dxa" w:w="20"/>
               <w:right w:type="dxa" w:w="75"/>
             </w:tcMar>
           </w:tcPr>
@@ -1457,9 +1457,9 @@
               <w:right w:val="single" w:color="D9DDE8" w:sz="4"/>
             </w:tcBorders>
             <w:tcMar>
-              <w:top w:type="dxa" w:w="30"/>
-              <w:left w:type="dxa" w:w="75"/>
-              <w:bottom w:type="dxa" w:w="30"/>
+              <w:top w:type="dxa" w:w="20"/>
+              <w:left w:type="dxa" w:w="75"/>
+              <w:bottom w:type="dxa" w:w="20"/>
               <w:right w:type="dxa" w:w="75"/>
             </w:tcMar>
           </w:tcPr>
@@ -1486,9 +1486,9 @@
               <w:right w:val="single" w:color="D9DDE8" w:sz="4"/>
             </w:tcBorders>
             <w:tcMar>
-              <w:top w:type="dxa" w:w="30"/>
-              <w:left w:type="dxa" w:w="75"/>
-              <w:bottom w:type="dxa" w:w="30"/>
+              <w:top w:type="dxa" w:w="20"/>
+              <w:left w:type="dxa" w:w="75"/>
+              <w:bottom w:type="dxa" w:w="20"/>
               <w:right w:type="dxa" w:w="75"/>
             </w:tcMar>
           </w:tcPr>
@@ -1515,9 +1515,9 @@
               <w:right w:val="single" w:color="D9DDE8" w:sz="4"/>
             </w:tcBorders>
             <w:tcMar>
-              <w:top w:type="dxa" w:w="30"/>
-              <w:left w:type="dxa" w:w="75"/>
-              <w:bottom w:type="dxa" w:w="30"/>
+              <w:top w:type="dxa" w:w="20"/>
+              <w:left w:type="dxa" w:w="75"/>
+              <w:bottom w:type="dxa" w:w="20"/>
               <w:right w:type="dxa" w:w="75"/>
             </w:tcMar>
           </w:tcPr>
@@ -1544,9 +1544,9 @@
               <w:right w:val="single" w:color="D9DDE8" w:sz="4"/>
             </w:tcBorders>
             <w:tcMar>
-              <w:top w:type="dxa" w:w="30"/>
-              <w:left w:type="dxa" w:w="75"/>
-              <w:bottom w:type="dxa" w:w="30"/>
+              <w:top w:type="dxa" w:w="20"/>
+              <w:left w:type="dxa" w:w="75"/>
+              <w:bottom w:type="dxa" w:w="20"/>
               <w:right w:type="dxa" w:w="75"/>
             </w:tcMar>
           </w:tcPr>
@@ -1588,9 +1588,9 @@
             </w:tcBorders>
             <w:shd w:fill="F7F8FC" w:color="auto" w:val="clear"/>
             <w:tcMar>
-              <w:top w:type="dxa" w:w="30"/>
-              <w:left w:type="dxa" w:w="75"/>
-              <w:bottom w:type="dxa" w:w="30"/>
+              <w:top w:type="dxa" w:w="20"/>
+              <w:left w:type="dxa" w:w="75"/>
+              <w:bottom w:type="dxa" w:w="20"/>
               <w:right w:type="dxa" w:w="75"/>
             </w:tcMar>
           </w:tcPr>
@@ -1618,9 +1618,9 @@
             </w:tcBorders>
             <w:shd w:fill="F7F8FC" w:color="auto" w:val="clear"/>
             <w:tcMar>
-              <w:top w:type="dxa" w:w="30"/>
-              <w:left w:type="dxa" w:w="75"/>
-              <w:bottom w:type="dxa" w:w="30"/>
+              <w:top w:type="dxa" w:w="20"/>
+              <w:left w:type="dxa" w:w="75"/>
+              <w:bottom w:type="dxa" w:w="20"/>
               <w:right w:type="dxa" w:w="75"/>
             </w:tcMar>
           </w:tcPr>
@@ -1648,9 +1648,9 @@
             </w:tcBorders>
             <w:shd w:fill="F7F8FC" w:color="auto" w:val="clear"/>
             <w:tcMar>
-              <w:top w:type="dxa" w:w="30"/>
-              <w:left w:type="dxa" w:w="75"/>
-              <w:bottom w:type="dxa" w:w="30"/>
+              <w:top w:type="dxa" w:w="20"/>
+              <w:left w:type="dxa" w:w="75"/>
+              <w:bottom w:type="dxa" w:w="20"/>
               <w:right w:type="dxa" w:w="75"/>
             </w:tcMar>
           </w:tcPr>
@@ -1678,9 +1678,9 @@
             </w:tcBorders>
             <w:shd w:fill="F7F8FC" w:color="auto" w:val="clear"/>
             <w:tcMar>
-              <w:top w:type="dxa" w:w="30"/>
-              <w:left w:type="dxa" w:w="75"/>
-              <w:bottom w:type="dxa" w:w="30"/>
+              <w:top w:type="dxa" w:w="20"/>
+              <w:left w:type="dxa" w:w="75"/>
+              <w:bottom w:type="dxa" w:w="20"/>
               <w:right w:type="dxa" w:w="75"/>
             </w:tcMar>
           </w:tcPr>
@@ -1712,9 +1712,9 @@
               <w:right w:val="single" w:color="D9DDE8" w:sz="4"/>
             </w:tcBorders>
             <w:tcMar>
-              <w:top w:type="dxa" w:w="30"/>
-              <w:left w:type="dxa" w:w="75"/>
-              <w:bottom w:type="dxa" w:w="30"/>
+              <w:top w:type="dxa" w:w="20"/>
+              <w:left w:type="dxa" w:w="75"/>
+              <w:bottom w:type="dxa" w:w="20"/>
               <w:right w:type="dxa" w:w="75"/>
             </w:tcMar>
           </w:tcPr>
@@ -1741,9 +1741,9 @@
               <w:right w:val="single" w:color="D9DDE8" w:sz="4"/>
             </w:tcBorders>
             <w:tcMar>
-              <w:top w:type="dxa" w:w="30"/>
-              <w:left w:type="dxa" w:w="75"/>
-              <w:bottom w:type="dxa" w:w="30"/>
+              <w:top w:type="dxa" w:w="20"/>
+              <w:left w:type="dxa" w:w="75"/>
+              <w:bottom w:type="dxa" w:w="20"/>
               <w:right w:type="dxa" w:w="75"/>
             </w:tcMar>
           </w:tcPr>
@@ -1770,9 +1770,9 @@
               <w:right w:val="single" w:color="D9DDE8" w:sz="4"/>
             </w:tcBorders>
             <w:tcMar>
-              <w:top w:type="dxa" w:w="30"/>
-              <w:left w:type="dxa" w:w="75"/>
-              <w:bottom w:type="dxa" w:w="30"/>
+              <w:top w:type="dxa" w:w="20"/>
+              <w:left w:type="dxa" w:w="75"/>
+              <w:bottom w:type="dxa" w:w="20"/>
               <w:right w:type="dxa" w:w="75"/>
             </w:tcMar>
           </w:tcPr>
@@ -1799,9 +1799,9 @@
               <w:right w:val="single" w:color="D9DDE8" w:sz="4"/>
             </w:tcBorders>
             <w:tcMar>
-              <w:top w:type="dxa" w:w="30"/>
-              <w:left w:type="dxa" w:w="75"/>
-              <w:bottom w:type="dxa" w:w="30"/>
+              <w:top w:type="dxa" w:w="20"/>
+              <w:left w:type="dxa" w:w="75"/>
+              <w:bottom w:type="dxa" w:w="20"/>
               <w:right w:type="dxa" w:w="75"/>
             </w:tcMar>
           </w:tcPr>
@@ -1834,9 +1834,9 @@
             </w:tcBorders>
             <w:shd w:fill="F7F8FC" w:color="auto" w:val="clear"/>
             <w:tcMar>
-              <w:top w:type="dxa" w:w="30"/>
-              <w:left w:type="dxa" w:w="75"/>
-              <w:bottom w:type="dxa" w:w="30"/>
+              <w:top w:type="dxa" w:w="20"/>
+              <w:left w:type="dxa" w:w="75"/>
+              <w:bottom w:type="dxa" w:w="20"/>
               <w:right w:type="dxa" w:w="75"/>
             </w:tcMar>
           </w:tcPr>
@@ -1864,9 +1864,9 @@
             </w:tcBorders>
             <w:shd w:fill="F7F8FC" w:color="auto" w:val="clear"/>
             <w:tcMar>
-              <w:top w:type="dxa" w:w="30"/>
-              <w:left w:type="dxa" w:w="75"/>
-              <w:bottom w:type="dxa" w:w="30"/>
+              <w:top w:type="dxa" w:w="20"/>
+              <w:left w:type="dxa" w:w="75"/>
+              <w:bottom w:type="dxa" w:w="20"/>
               <w:right w:type="dxa" w:w="75"/>
             </w:tcMar>
           </w:tcPr>
@@ -1894,9 +1894,9 @@
             </w:tcBorders>
             <w:shd w:fill="F7F8FC" w:color="auto" w:val="clear"/>
             <w:tcMar>
-              <w:top w:type="dxa" w:w="30"/>
-              <w:left w:type="dxa" w:w="75"/>
-              <w:bottom w:type="dxa" w:w="30"/>
+              <w:top w:type="dxa" w:w="20"/>
+              <w:left w:type="dxa" w:w="75"/>
+              <w:bottom w:type="dxa" w:w="20"/>
               <w:right w:type="dxa" w:w="75"/>
             </w:tcMar>
           </w:tcPr>
@@ -1924,9 +1924,9 @@
             </w:tcBorders>
             <w:shd w:fill="F7F8FC" w:color="auto" w:val="clear"/>
             <w:tcMar>
-              <w:top w:type="dxa" w:w="30"/>
-              <w:left w:type="dxa" w:w="75"/>
-              <w:bottom w:type="dxa" w:w="30"/>
+              <w:top w:type="dxa" w:w="20"/>
+              <w:left w:type="dxa" w:w="75"/>
+              <w:bottom w:type="dxa" w:w="20"/>
               <w:right w:type="dxa" w:w="75"/>
             </w:tcMar>
           </w:tcPr>
@@ -2171,9 +2171,9 @@
               <w:right w:val="none" w:color="FFFFFF" w:sz="0"/>
             </w:tcBorders>
             <w:tcMar>
-              <w:top w:type="dxa" w:w="30"/>
-              <w:left w:type="dxa" w:w="75"/>
-              <w:bottom w:type="dxa" w:w="30"/>
+              <w:top w:type="dxa" w:w="20"/>
+              <w:left w:type="dxa" w:w="75"/>
+              <w:bottom w:type="dxa" w:w="20"/>
               <w:right w:type="dxa" w:w="75"/>
             </w:tcMar>
           </w:tcPr>
@@ -2189,7 +2189,7 @@
                 <w:sz w:val="16"/>
                 <w:szCs w:val="16"/>
               </w:rPr>
-              <w:t xml:space="preserve">Mission map</w:t>
+              <w:t xml:space="preserve">Mission globe</w:t>
             </w:r>
           </w:p>
           <w:p>
@@ -2200,7 +2200,7 @@
             <w:r>
               <w:drawing>
                 <wp:inline distT="0" distB="0" distL="0" distR="0">
-                  <wp:extent cx="2924175" cy="1514475"/>
+                  <wp:extent cx="2743200" cy="1419225"/>
                   <wp:effectExtent t="0" r="0" b="0" l="0"/>
                   <wp:docPr id="1" name="R1-map" descr="R1-map" title="R1-map"/>
                   <wp:cNvGraphicFramePr>
@@ -2225,7 +2225,7 @@
                         <pic:spPr bwMode="auto">
                           <a:xfrm>
                             <a:off x="0" y="0"/>
-                            <a:ext cx="2924175" cy="1514475"/>
+                            <a:ext cx="2743200" cy="1419225"/>
                           </a:xfrm>
                           <a:prstGeom prst="rect">
                             <a:avLst/>
@@ -2272,7 +2272,7 @@
                 <w:sz w:val="15"/>
                 <w:szCs w:val="15"/>
               </w:rPr>
-              <w:t xml:space="preserve"> Nearby offices grouped into one numbered pin.</w:t>
+              <w:t xml:space="preserve"> Nearby offices grouped in one pin.</w:t>
             </w:r>
           </w:p>
           <w:p>
@@ -2293,7 +2293,7 @@
                 <w:sz w:val="15"/>
                 <w:szCs w:val="15"/>
               </w:rPr>
-              <w:t xml:space="preserve"> Mission type, status and data-verification flag.  </w:t>
+              <w:t xml:space="preserve"> Type, status, data-verification flag.  </w:t>
             </w:r>
             <w:r>
               <w:rPr>
@@ -2309,7 +2309,7 @@
                 <w:sz w:val="15"/>
                 <w:szCs w:val="15"/>
               </w:rPr>
-              <w:t xml:space="preserve"> Every country a regional mandate covers.</w:t>
+              <w:t xml:space="preserve"> Mandate countries.</w:t>
             </w:r>
           </w:p>
         </w:tc>
@@ -2323,9 +2323,9 @@
               <w:right w:val="none" w:color="FFFFFF" w:sz="0"/>
             </w:tcBorders>
             <w:tcMar>
-              <w:top w:type="dxa" w:w="30"/>
-              <w:left w:type="dxa" w:w="75"/>
-              <w:bottom w:type="dxa" w:w="30"/>
+              <w:top w:type="dxa" w:w="20"/>
+              <w:left w:type="dxa" w:w="75"/>
+              <w:bottom w:type="dxa" w:w="20"/>
               <w:right w:type="dxa" w:w="75"/>
             </w:tcMar>
           </w:tcPr>
@@ -2352,7 +2352,7 @@
             <w:r>
               <w:drawing>
                 <wp:inline distT="0" distB="0" distL="0" distR="0">
-                  <wp:extent cx="2790825" cy="1524000"/>
+                  <wp:extent cx="2647950" cy="1447800"/>
                   <wp:effectExtent t="0" r="0" b="0" l="0"/>
                   <wp:docPr id="1" name="R2-decision" descr="R2-decision" title="R2-decision"/>
                   <wp:cNvGraphicFramePr>
@@ -2377,7 +2377,7 @@
                         <pic:spPr bwMode="auto">
                           <a:xfrm>
                             <a:off x="0" y="0"/>
-                            <a:ext cx="2790825" cy="1524000"/>
+                            <a:ext cx="2647950" cy="1447800"/>
                           </a:xfrm>
                           <a:prstGeom prst="rect">
                             <a:avLst/>
@@ -2461,7 +2461,7 @@
                 <w:sz w:val="15"/>
                 <w:szCs w:val="15"/>
               </w:rPr>
-              <w:t xml:space="preserve"> Bias at play, with a counter-strategy.  </w:t>
+              <w:t xml:space="preserve"> Bias and counter-strategy.  </w:t>
             </w:r>
             <w:r>
               <w:rPr>
@@ -2477,7 +2477,7 @@
                 <w:sz w:val="15"/>
                 <w:szCs w:val="15"/>
               </w:rPr>
-              <w:t xml:space="preserve"> Dimensions overlooked.  </w:t>
+              <w:t xml:space="preserve"> Missed dimensions.  </w:t>
             </w:r>
             <w:r>
               <w:rPr>
@@ -2493,7 +2493,7 @@
                 <w:sz w:val="15"/>
                 <w:szCs w:val="15"/>
               </w:rPr>
-              <w:t xml:space="preserve"> The strongest option.</w:t>
+              <w:t xml:space="preserve"> Best option.</w:t>
             </w:r>
           </w:p>
         </w:tc>
@@ -2725,9 +2725,9 @@
             </w:tcBorders>
             <w:shd w:fill="12406F" w:color="auto" w:val="clear"/>
             <w:tcMar>
-              <w:top w:type="dxa" w:w="30"/>
-              <w:left w:type="dxa" w:w="75"/>
-              <w:bottom w:type="dxa" w:w="30"/>
+              <w:top w:type="dxa" w:w="20"/>
+              <w:left w:type="dxa" w:w="75"/>
+              <w:bottom w:type="dxa" w:w="20"/>
               <w:right w:type="dxa" w:w="75"/>
             </w:tcMar>
           </w:tcPr>
@@ -2758,9 +2758,9 @@
             </w:tcBorders>
             <w:shd w:fill="12406F" w:color="auto" w:val="clear"/>
             <w:tcMar>
-              <w:top w:type="dxa" w:w="30"/>
-              <w:left w:type="dxa" w:w="75"/>
-              <w:bottom w:type="dxa" w:w="30"/>
+              <w:top w:type="dxa" w:w="20"/>
+              <w:left w:type="dxa" w:w="75"/>
+              <w:bottom w:type="dxa" w:w="20"/>
               <w:right w:type="dxa" w:w="75"/>
             </w:tcMar>
           </w:tcPr>
@@ -2791,9 +2791,9 @@
             </w:tcBorders>
             <w:shd w:fill="12406F" w:color="auto" w:val="clear"/>
             <w:tcMar>
-              <w:top w:type="dxa" w:w="30"/>
-              <w:left w:type="dxa" w:w="75"/>
-              <w:bottom w:type="dxa" w:w="30"/>
+              <w:top w:type="dxa" w:w="20"/>
+              <w:left w:type="dxa" w:w="75"/>
+              <w:bottom w:type="dxa" w:w="20"/>
               <w:right w:type="dxa" w:w="75"/>
             </w:tcMar>
           </w:tcPr>
@@ -2824,9 +2824,9 @@
             </w:tcBorders>
             <w:shd w:fill="12406F" w:color="auto" w:val="clear"/>
             <w:tcMar>
-              <w:top w:type="dxa" w:w="30"/>
-              <w:left w:type="dxa" w:w="75"/>
-              <w:bottom w:type="dxa" w:w="30"/>
+              <w:top w:type="dxa" w:w="20"/>
+              <w:left w:type="dxa" w:w="75"/>
+              <w:bottom w:type="dxa" w:w="20"/>
               <w:right w:type="dxa" w:w="75"/>
             </w:tcMar>
           </w:tcPr>
@@ -2861,9 +2861,9 @@
               <w:right w:val="single" w:color="D9DDE8" w:sz="4"/>
             </w:tcBorders>
             <w:tcMar>
-              <w:top w:type="dxa" w:w="30"/>
-              <w:left w:type="dxa" w:w="75"/>
-              <w:bottom w:type="dxa" w:w="30"/>
+              <w:top w:type="dxa" w:w="20"/>
+              <w:left w:type="dxa" w:w="75"/>
+              <w:bottom w:type="dxa" w:w="20"/>
               <w:right w:type="dxa" w:w="75"/>
             </w:tcMar>
           </w:tcPr>
@@ -2890,9 +2890,9 @@
               <w:right w:val="single" w:color="D9DDE8" w:sz="4"/>
             </w:tcBorders>
             <w:tcMar>
-              <w:top w:type="dxa" w:w="30"/>
-              <w:left w:type="dxa" w:w="75"/>
-              <w:bottom w:type="dxa" w:w="30"/>
+              <w:top w:type="dxa" w:w="20"/>
+              <w:left w:type="dxa" w:w="75"/>
+              <w:bottom w:type="dxa" w:w="20"/>
               <w:right w:type="dxa" w:w="75"/>
             </w:tcMar>
           </w:tcPr>
@@ -2919,9 +2919,9 @@
               <w:right w:val="single" w:color="D9DDE8" w:sz="4"/>
             </w:tcBorders>
             <w:tcMar>
-              <w:top w:type="dxa" w:w="30"/>
-              <w:left w:type="dxa" w:w="75"/>
-              <w:bottom w:type="dxa" w:w="30"/>
+              <w:top w:type="dxa" w:w="20"/>
+              <w:left w:type="dxa" w:w="75"/>
+              <w:bottom w:type="dxa" w:w="20"/>
               <w:right w:type="dxa" w:w="75"/>
             </w:tcMar>
           </w:tcPr>
@@ -2948,9 +2948,9 @@
               <w:right w:val="single" w:color="D9DDE8" w:sz="4"/>
             </w:tcBorders>
             <w:tcMar>
-              <w:top w:type="dxa" w:w="30"/>
-              <w:left w:type="dxa" w:w="75"/>
-              <w:bottom w:type="dxa" w:w="30"/>
+              <w:top w:type="dxa" w:w="20"/>
+              <w:left w:type="dxa" w:w="75"/>
+              <w:bottom w:type="dxa" w:w="20"/>
               <w:right w:type="dxa" w:w="75"/>
             </w:tcMar>
           </w:tcPr>
@@ -2992,9 +2992,9 @@
             </w:tcBorders>
             <w:shd w:fill="F7F8FC" w:color="auto" w:val="clear"/>
             <w:tcMar>
-              <w:top w:type="dxa" w:w="30"/>
-              <w:left w:type="dxa" w:w="75"/>
-              <w:bottom w:type="dxa" w:w="30"/>
+              <w:top w:type="dxa" w:w="20"/>
+              <w:left w:type="dxa" w:w="75"/>
+              <w:bottom w:type="dxa" w:w="20"/>
               <w:right w:type="dxa" w:w="75"/>
             </w:tcMar>
           </w:tcPr>
@@ -3022,9 +3022,9 @@
             </w:tcBorders>
             <w:shd w:fill="F7F8FC" w:color="auto" w:val="clear"/>
             <w:tcMar>
-              <w:top w:type="dxa" w:w="30"/>
-              <w:left w:type="dxa" w:w="75"/>
-              <w:bottom w:type="dxa" w:w="30"/>
+              <w:top w:type="dxa" w:w="20"/>
+              <w:left w:type="dxa" w:w="75"/>
+              <w:bottom w:type="dxa" w:w="20"/>
               <w:right w:type="dxa" w:w="75"/>
             </w:tcMar>
           </w:tcPr>
@@ -3052,9 +3052,9 @@
             </w:tcBorders>
             <w:shd w:fill="F7F8FC" w:color="auto" w:val="clear"/>
             <w:tcMar>
-              <w:top w:type="dxa" w:w="30"/>
-              <w:left w:type="dxa" w:w="75"/>
-              <w:bottom w:type="dxa" w:w="30"/>
+              <w:top w:type="dxa" w:w="20"/>
+              <w:left w:type="dxa" w:w="75"/>
+              <w:bottom w:type="dxa" w:w="20"/>
               <w:right w:type="dxa" w:w="75"/>
             </w:tcMar>
           </w:tcPr>
@@ -3082,9 +3082,9 @@
             </w:tcBorders>
             <w:shd w:fill="F7F8FC" w:color="auto" w:val="clear"/>
             <w:tcMar>
-              <w:top w:type="dxa" w:w="30"/>
-              <w:left w:type="dxa" w:w="75"/>
-              <w:bottom w:type="dxa" w:w="30"/>
+              <w:top w:type="dxa" w:w="20"/>
+              <w:left w:type="dxa" w:w="75"/>
+              <w:bottom w:type="dxa" w:w="20"/>
               <w:right w:type="dxa" w:w="75"/>
             </w:tcMar>
           </w:tcPr>
@@ -3116,9 +3116,9 @@
               <w:right w:val="single" w:color="D9DDE8" w:sz="4"/>
             </w:tcBorders>
             <w:tcMar>
-              <w:top w:type="dxa" w:w="30"/>
-              <w:left w:type="dxa" w:w="75"/>
-              <w:bottom w:type="dxa" w:w="30"/>
+              <w:top w:type="dxa" w:w="20"/>
+              <w:left w:type="dxa" w:w="75"/>
+              <w:bottom w:type="dxa" w:w="20"/>
               <w:right w:type="dxa" w:w="75"/>
             </w:tcMar>
           </w:tcPr>
@@ -3145,9 +3145,9 @@
               <w:right w:val="single" w:color="D9DDE8" w:sz="4"/>
             </w:tcBorders>
             <w:tcMar>
-              <w:top w:type="dxa" w:w="30"/>
-              <w:left w:type="dxa" w:w="75"/>
-              <w:bottom w:type="dxa" w:w="30"/>
+              <w:top w:type="dxa" w:w="20"/>
+              <w:left w:type="dxa" w:w="75"/>
+              <w:bottom w:type="dxa" w:w="20"/>
               <w:right w:type="dxa" w:w="75"/>
             </w:tcMar>
           </w:tcPr>
@@ -3174,9 +3174,9 @@
               <w:right w:val="single" w:color="D9DDE8" w:sz="4"/>
             </w:tcBorders>
             <w:tcMar>
-              <w:top w:type="dxa" w:w="30"/>
-              <w:left w:type="dxa" w:w="75"/>
-              <w:bottom w:type="dxa" w:w="30"/>
+              <w:top w:type="dxa" w:w="20"/>
+              <w:left w:type="dxa" w:w="75"/>
+              <w:bottom w:type="dxa" w:w="20"/>
               <w:right w:type="dxa" w:w="75"/>
             </w:tcMar>
           </w:tcPr>
@@ -3203,9 +3203,9 @@
               <w:right w:val="single" w:color="D9DDE8" w:sz="4"/>
             </w:tcBorders>
             <w:tcMar>
-              <w:top w:type="dxa" w:w="30"/>
-              <w:left w:type="dxa" w:w="75"/>
-              <w:bottom w:type="dxa" w:w="30"/>
+              <w:top w:type="dxa" w:w="20"/>
+              <w:left w:type="dxa" w:w="75"/>
+              <w:bottom w:type="dxa" w:w="20"/>
               <w:right w:type="dxa" w:w="75"/>
             </w:tcMar>
           </w:tcPr>
@@ -3247,9 +3247,9 @@
             </w:tcBorders>
             <w:shd w:fill="F7F8FC" w:color="auto" w:val="clear"/>
             <w:tcMar>
-              <w:top w:type="dxa" w:w="30"/>
-              <w:left w:type="dxa" w:w="75"/>
-              <w:bottom w:type="dxa" w:w="30"/>
+              <w:top w:type="dxa" w:w="20"/>
+              <w:left w:type="dxa" w:w="75"/>
+              <w:bottom w:type="dxa" w:w="20"/>
               <w:right w:type="dxa" w:w="75"/>
             </w:tcMar>
           </w:tcPr>
@@ -3277,9 +3277,9 @@
             </w:tcBorders>
             <w:shd w:fill="F7F8FC" w:color="auto" w:val="clear"/>
             <w:tcMar>
-              <w:top w:type="dxa" w:w="30"/>
-              <w:left w:type="dxa" w:w="75"/>
-              <w:bottom w:type="dxa" w:w="30"/>
+              <w:top w:type="dxa" w:w="20"/>
+              <w:left w:type="dxa" w:w="75"/>
+              <w:bottom w:type="dxa" w:w="20"/>
               <w:right w:type="dxa" w:w="75"/>
             </w:tcMar>
           </w:tcPr>
@@ -3307,9 +3307,9 @@
             </w:tcBorders>
             <w:shd w:fill="F7F8FC" w:color="auto" w:val="clear"/>
             <w:tcMar>
-              <w:top w:type="dxa" w:w="30"/>
-              <w:left w:type="dxa" w:w="75"/>
-              <w:bottom w:type="dxa" w:w="30"/>
+              <w:top w:type="dxa" w:w="20"/>
+              <w:left w:type="dxa" w:w="75"/>
+              <w:bottom w:type="dxa" w:w="20"/>
               <w:right w:type="dxa" w:w="75"/>
             </w:tcMar>
           </w:tcPr>
@@ -3337,9 +3337,9 @@
             </w:tcBorders>
             <w:shd w:fill="F7F8FC" w:color="auto" w:val="clear"/>
             <w:tcMar>
-              <w:top w:type="dxa" w:w="30"/>
-              <w:left w:type="dxa" w:w="75"/>
-              <w:bottom w:type="dxa" w:w="30"/>
+              <w:top w:type="dxa" w:w="20"/>
+              <w:left w:type="dxa" w:w="75"/>
+              <w:bottom w:type="dxa" w:w="20"/>
               <w:right w:type="dxa" w:w="75"/>
             </w:tcMar>
           </w:tcPr>
@@ -3401,9 +3401,9 @@
               <w:right w:val="none" w:color="FFFFFF" w:sz="0"/>
             </w:tcBorders>
             <w:tcMar>
-              <w:top w:type="dxa" w:w="30"/>
-              <w:left w:type="dxa" w:w="75"/>
-              <w:bottom w:type="dxa" w:w="30"/>
+              <w:top w:type="dxa" w:w="20"/>
+              <w:left w:type="dxa" w:w="75"/>
+              <w:bottom w:type="dxa" w:w="20"/>
               <w:right w:type="dxa" w:w="75"/>
             </w:tcMar>
           </w:tcPr>
@@ -3430,7 +3430,7 @@
             <w:r>
               <w:drawing>
                 <wp:inline distT="0" distB="0" distL="0" distR="0">
-                  <wp:extent cx="2381250" cy="1333500"/>
+                  <wp:extent cx="2238375" cy="1257300"/>
                   <wp:effectExtent t="0" r="0" b="0" l="0"/>
                   <wp:docPr id="1" name="T1-debrief" descr="T1-debrief" title="T1-debrief"/>
                   <wp:cNvGraphicFramePr>
@@ -3455,7 +3455,7 @@
                         <pic:spPr bwMode="auto">
                           <a:xfrm>
                             <a:off x="0" y="0"/>
-                            <a:ext cx="2381250" cy="1333500"/>
+                            <a:ext cx="2238375" cy="1257300"/>
                           </a:xfrm>
                           <a:prstGeom prst="rect">
                             <a:avLst/>
@@ -3553,9 +3553,9 @@
               <w:right w:val="none" w:color="FFFFFF" w:sz="0"/>
             </w:tcBorders>
             <w:tcMar>
-              <w:top w:type="dxa" w:w="30"/>
-              <w:left w:type="dxa" w:w="75"/>
-              <w:bottom w:type="dxa" w:w="30"/>
+              <w:top w:type="dxa" w:w="20"/>
+              <w:left w:type="dxa" w:w="75"/>
+              <w:bottom w:type="dxa" w:w="20"/>
               <w:right w:type="dxa" w:w="75"/>
             </w:tcMar>
           </w:tcPr>
@@ -3582,7 +3582,7 @@
             <w:r>
               <w:drawing>
                 <wp:inline distT="0" distB="0" distL="0" distR="0">
-                  <wp:extent cx="2466975" cy="1362075"/>
+                  <wp:extent cx="2333625" cy="1285875"/>
                   <wp:effectExtent t="0" r="0" b="0" l="0"/>
                   <wp:docPr id="1" name="T2-concept" descr="T2-concept" title="T2-concept"/>
                   <wp:cNvGraphicFramePr>
@@ -3607,7 +3607,7 @@
                         <pic:spPr bwMode="auto">
                           <a:xfrm>
                             <a:off x="0" y="0"/>
-                            <a:ext cx="2466975" cy="1362075"/>
+                            <a:ext cx="2333625" cy="1285875"/>
                           </a:xfrm>
                           <a:prstGeom prst="rect">
                             <a:avLst/>
@@ -3697,6 +3697,80 @@
         </w:tc>
       </w:tr>
     </w:tbl>
+    <w:p>
+      <w:pPr>
+        <w:keepNext/>
+        <w:spacing w:after="10" w:before="40"/>
+      </w:pPr>
+      <w:r>
+        <w:rPr>
+          <w:b/>
+          <w:bCs/>
+          <w:color w:val="6D4BD1"/>
+          <w:sz w:val="16"/>
+          <w:szCs w:val="16"/>
+        </w:rPr>
+        <w:t xml:space="preserve">References</w:t>
+      </w:r>
+    </w:p>
+    <w:p>
+      <w:pPr>
+        <w:spacing w:after="10" w:line="220"/>
+        <w:ind w:left="360" w:hanging="360"/>
+      </w:pPr>
+      <w:r>
+        <w:rPr>
+          <w:sz w:val="15"/>
+          <w:szCs w:val="15"/>
+        </w:rPr>
+        <w:t xml:space="preserve">INTERMAPS. (2024). </w:t>
+      </w:r>
+      <w:r>
+        <w:rPr>
+          <w:i/>
+          <w:iCs/>
+          <w:sz w:val="15"/>
+          <w:szCs w:val="15"/>
+        </w:rPr>
+        <w:t xml:space="preserve">Relief Maps+</w:t>
+      </w:r>
+      <w:r>
+        <w:rPr>
+          <w:sz w:val="15"/>
+          <w:szCs w:val="15"/>
+        </w:rPr>
+        <w:t xml:space="preserve"> [Web application]. Universitat Pompeu Fabra. https://reliefmaps.upf.edu</w:t>
+      </w:r>
+    </w:p>
+    <w:p>
+      <w:pPr>
+        <w:spacing w:after="10" w:line="220"/>
+        <w:ind w:left="360" w:hanging="360"/>
+      </w:pPr>
+      <w:r>
+        <w:rPr>
+          <w:sz w:val="15"/>
+          <w:szCs w:val="15"/>
+        </w:rPr>
+        <w:t xml:space="preserve">Rodó-Zárate, M. (2023). Intersectionality and the spatiality of emotions in feminist research. </w:t>
+      </w:r>
+      <w:r>
+        <w:rPr>
+          <w:i/>
+          <w:iCs/>
+          <w:sz w:val="15"/>
+          <w:szCs w:val="15"/>
+        </w:rPr>
+        <w:t xml:space="preserve">The Professional Geographer, 75</w:t>
+      </w:r>
+      <w:r>
+        <w:rPr>
+          <w:sz w:val="15"/>
+          <w:szCs w:val="15"/>
+        </w:rPr>
+        <w:t xml:space="preserve">(4), 676–681. https://doi.org/10.1080/00330124.2022.2075406</w:t>
+      </w:r>
+    </w:p>
     <w:sectPr>
       <w:pgSz w:w="12240" w:h="15840" w:orient="portrait"/>
       <w:pgMar w:top="720" w:right="720" w:bottom="720" w:left="720" w:header="708" w:footer="708" w:gutter="0"/>

</xml_diff>